<commit_message>
v4 LLM matrix: 18 live Bailian runs + sub-report 06 walkthrough swap
- llm_matrix_v4: qwen-max/plus/turbo x std(setpoint24)/hard(setpoint22) x r71-73,
  provider openai-compatible, 18/18 live, 1/18 deployed (qwen-max_std_r72);
  3/18 hard_r73 fallback rollouts unstable (fallback property, disclosed).
  Per-run 5.4-25.4s, ~4.3min total, zero retries. Keys via .env (never recorded).
- aggregate matrix_summary.csv + AGGREGATE_REPORT.md via aggregate_llm_matrix.py.
- 06 report: walkthrough swapped to v4 qwen-max_std_r72 session
  (baseline 0.5175/59.49 -> 0.4657/58.86, +1.05%, -10.0% trust-region bound);
  v3 walkthrough kept as对照; §6/§7补跑 recomputed for v4 gains + 4 figures
  regenerated; §5/§8/appendix updated with v4 distribution stats.
- 00 overview honesty note: v3 5/18 + v4 1/18 side by side.
- 06+00 docx re-rendered (others untouched); provenance.csv + manifest.yaml.
- 39 pytest pass.
</commit_message>
<xml_diff>
--- a/reports/分报告/00_总览与阅读指引.docx
+++ b/reports/分报告/00_总览与阅读指引.docx
@@ -754,7 +754,7 @@
           <w:i w:val="0"/>
           <w:sz w:val="21"/>
         </w:rPr>
-        <w:t>：100 ms PI 内环（条件积分抗饱和）+ 2 s AI 增益调度层；AI 只调 Kp/Ki，不直接控制压缩机；四层安全保护（节拍解耦、增益界、单次变化 ≤25%、异常回退 IMC）。</w:t>
+        <w:t>：100 ms PI 内环（条件积分抗饱和）+ 三口径AI调度层（Python仿真300 s / 演示120 s / MCU墙钟2 s，详见 hvac_pid/timebase.py）；AI 只调 Kp/Ki，不直接控制压缩机；四层安全保护（节拍解耦、增益界、单次变化 ≤10%、异常回退 IMC）。</w:t>
       </w:r>
     </w:p>
     <w:p>
@@ -962,7 +962,7 @@
           <w:i w:val="0"/>
           <w:sz w:val="21"/>
         </w:rPr>
-        <w:t>（标注"补跑"，与 v3 同对象、同约束、同种子）；LLM 真实调用仅 2 次会话，输出非确定性未做统计表征。</w:t>
+        <w:t>（标注"补跑"，与 v3 同对象、同约束、同种子）；LLM 矩阵 v3（outputs_llm_matrix_v3）18 次真实调用、5/18 部署；v4 复现矩阵（artifacts/runs/v4-20260906-8ac9bf4/llm_matrix_v4）18 次真实调用、1/18 部署，另 3/18 fallback 自身不稳定；06 走读已换 v4 会话（qwen-max_std_r72）；输出非确定性需报告多次运行分布与回退率。</w:t>
       </w:r>
     </w:p>
     <w:p>
@@ -3679,7 +3679,7 @@
           <w:i w:val="0"/>
           <w:sz w:val="21"/>
         </w:rPr>
-        <w:t>：投运后控制器运行中在线修正自身参数（本项目：FNN / RL，每 2 s）。</w:t>
+        <w:t>：投运后控制器运行中在线修正自身参数（本项目：FNN / RL，Python仿真300 s / 演示120 s / MCU墙钟2 s三口径分离）。</w:t>
       </w:r>
     </w:p>
     <w:p>
@@ -5823,7 +5823,7 @@
                 <w:i w:val="0"/>
                 <w:sz w:val="18"/>
               </w:rPr>
-              <w:t>配图文件（</w:t>
+              <w:t xml:space="preserve">配图文件（新图在 </w:t>
             </w:r>
             <w:r>
               <w:rPr>
@@ -5842,7 +5842,45 @@
                 <w:i w:val="0"/>
                 <w:sz w:val="18"/>
               </w:rPr>
-              <w:t>）</w:t>
+              <w:t xml:space="preserve">；22 张复用图单源于 </w:t>
+            </w:r>
+            <w:r>
+              <w:rPr>
+                <w:rFonts w:ascii="Consolas" w:hAnsi="Consolas" w:eastAsia="微软雅黑"/>
+                <w:b w:val="0"/>
+                <w:i w:val="0"/>
+                <w:color w:val="A31515"/>
+                <w:sz w:val="16"/>
+              </w:rPr>
+              <w:t>reports/figures/</w:t>
+            </w:r>
+            <w:r>
+              <w:rPr>
+                <w:rFonts w:ascii="微软雅黑" w:hAnsi="微软雅黑" w:eastAsia="微软雅黑"/>
+                <w:b/>
+                <w:i w:val="0"/>
+                <w:sz w:val="18"/>
+              </w:rPr>
+              <w:t xml:space="preserve">，正文经 </w:t>
+            </w:r>
+            <w:r>
+              <w:rPr>
+                <w:rFonts w:ascii="Consolas" w:hAnsi="Consolas" w:eastAsia="微软雅黑"/>
+                <w:b w:val="0"/>
+                <w:i w:val="0"/>
+                <w:color w:val="A31515"/>
+                <w:sz w:val="16"/>
+              </w:rPr>
+              <w:t>../figures/</w:t>
+            </w:r>
+            <w:r>
+              <w:rPr>
+                <w:rFonts w:ascii="微软雅黑" w:hAnsi="微软雅黑" w:eastAsia="微软雅黑"/>
+                <w:b/>
+                <w:i w:val="0"/>
+                <w:sz w:val="18"/>
+              </w:rPr>
+              <w:t xml:space="preserve"> 引用）</w:t>
             </w:r>
           </w:p>
         </w:tc>
@@ -7138,7 +7176,7 @@
                 <w:color w:val="A31515"/>
                 <w:sz w:val="16"/>
               </w:rPr>
-              <w:t>outputs/submission_package/</w:t>
+              <w:t>outputs_review_v3/submission_package/</w:t>
             </w:r>
           </w:p>
         </w:tc>
@@ -7227,6 +7265,34 @@
                 <w:sz w:val="16"/>
               </w:rPr>
               <w:t>outputs/</w:t>
+            </w:r>
+            <w:r>
+              <w:rPr>
+                <w:rFonts w:ascii="微软雅黑" w:hAnsi="微软雅黑" w:eastAsia="微软雅黑"/>
+                <w:b w:val="0"/>
+                <w:i w:val="0"/>
+                <w:sz w:val="18"/>
+              </w:rPr>
+              <w:t xml:space="preserve">（可重跑 regenerable scratch，封存以 </w:t>
+            </w:r>
+            <w:r>
+              <w:rPr>
+                <w:rFonts w:ascii="Consolas" w:hAnsi="Consolas" w:eastAsia="微软雅黑"/>
+                <w:b w:val="0"/>
+                <w:i w:val="0"/>
+                <w:color w:val="A31515"/>
+                <w:sz w:val="16"/>
+              </w:rPr>
+              <w:t>outputs_review_v3/</w:t>
+            </w:r>
+            <w:r>
+              <w:rPr>
+                <w:rFonts w:ascii="微软雅黑" w:hAnsi="微软雅黑" w:eastAsia="微软雅黑"/>
+                <w:b w:val="0"/>
+                <w:i w:val="0"/>
+                <w:sz w:val="18"/>
+              </w:rPr>
+              <w:t xml:space="preserve"> 为准）</w:t>
             </w:r>
           </w:p>
         </w:tc>

</xml_diff>

<commit_message>
reports: blog-tone pass over 00-08, structure frozen; ci slimmed to 2 legs
</commit_message>
<xml_diff>
--- a/reports/分报告/00_总览与阅读指引.docx
+++ b/reports/分报告/00_总览与阅读指引.docx
@@ -18,6 +18,32 @@
       </w:r>
     </w:p>
     <w:p/>
+    <w:p>
+      <w:pPr>
+        <w:spacing w:after="40"/>
+        <w:ind w:left="340"/>
+      </w:pPr>
+      <w:r>
+        <w:rPr>
+          <w:rFonts w:ascii="微软雅黑" w:hAnsi="微软雅黑" w:eastAsia="微软雅黑"/>
+          <w:b/>
+          <w:i w:val="0"/>
+          <w:color w:val="595959"/>
+          <w:sz w:val="19"/>
+        </w:rPr>
+        <w:t>30 秒看懂</w:t>
+      </w:r>
+      <w:r>
+        <w:rPr>
+          <w:rFonts w:ascii="微软雅黑" w:hAnsi="微软雅黑" w:eastAsia="微软雅黑"/>
+          <w:b w:val="0"/>
+          <w:i w:val="0"/>
+          <w:color w:val="595959"/>
+          <w:sz w:val="19"/>
+        </w:rPr>
+        <w:t>：这套报告回答"空调 PI 参数怎么调"——从经典公式（02/03）到自动搜索（04/05/06）再到在线自适应（07/08），每篇讲一个算法：原理一句话、一条可跑命令、结果怎么看。新手按 01→02/03→04/05/06→07/08 的顺序读。</w:t>
+      </w:r>
+    </w:p>
     <w:p>
       <w:pPr>
         <w:spacing w:after="80"/>
@@ -754,7 +780,7 @@
           <w:i w:val="0"/>
           <w:sz w:val="21"/>
         </w:rPr>
-        <w:t>：100 ms PI 内环（条件积分抗饱和）+ 三口径AI调度层（Python仿真300 s / 演示120 s / MCU墙钟2 s，详见 hvac_pid/timebase.py）；AI 只调 Kp/Ki，不直接控制压缩机；四层安全保护（节拍解耦、增益界、单次变化 ≤10%、异常回退 IMC）。</w:t>
+        <w:t>：100 ms PI 内环（条件积分抗饱和）+ 三口径AI调度层（Python仿真300 s / 演示120 s / MCU墙钟2 s，详见 hvac_pid/timebase.py）；AI 只调 Kp/Ki，不直接控制压缩机；四层保护（节拍解耦、增益界、单次变化 ≤10%、异常时切回 IMC）。</w:t>
       </w:r>
     </w:p>
     <w:p>
@@ -962,7 +988,7 @@
           <w:i w:val="0"/>
           <w:sz w:val="21"/>
         </w:rPr>
-        <w:t>（标注"补跑"，与 v3 同对象、同约束、同种子）；LLM 矩阵 v3（outputs_llm_matrix_v3）18 次真实调用、5/18 部署；v4 复现矩阵（artifacts/runs/v4-20260906-8ac9bf4/llm_matrix_v4）18 次真实调用、1/18 部署，另 3/18 fallback 自身不稳定；06 走读已换 v4 会话（qwen-max_std_r72）；输出非确定性需报告多次运行分布与回退率。</w:t>
+        <w:t>（标注"补跑"，即拿定好的参数重跑一遍、只画图不训练，与 v3 同对象、同约束、同种子）；LLM 矩阵 v3（outputs_llm_matrix_v3）18 次真实调用、5/18 采用；v4 复现矩阵（artifacts/runs/v4-20260906-8ac9bf4/llm_matrix_v4）18 次真实调用、1/18 采用，另 3/18 基线自身不稳定；06 走读已换 v4 会话（qwen-max_std_r72）；输出不稳定，必须报告多次运行的分布与采用率。</w:t>
       </w:r>
     </w:p>
     <w:p>
@@ -1757,7 +1783,7 @@
                 <w:i w:val="0"/>
                 <w:sz w:val="18"/>
               </w:rPr>
-              <w:t>保守 IMC 回退</w:t>
+              <w:t>保守 IMC 参数</w:t>
             </w:r>
           </w:p>
         </w:tc>
@@ -2492,7 +2518,7 @@
           <w:i w:val="0"/>
           <w:sz w:val="21"/>
         </w:rPr>
-        <w:t>而非优化目标，通过安全裕度 q 起作用（</w:t>
+        <w:t>而非优化目标，通过安全分 q 起作用（</w:t>
       </w:r>
       <w:r>
         <w:rPr>
@@ -2511,7 +2537,7 @@
           <w:i w:val="0"/>
           <w:sz w:val="21"/>
         </w:rPr>
-        <w:t xml:space="preserve"> 才允许部署）。一旦加权进目标，就可以靠"其他项足够好"来补偿违规，那就失去了硬约束的意义。</w:t>
+        <w:t xml:space="preserve"> 才允许采用）。一旦加权进目标，就可以靠"其他项足够好"来补偿违规，那就失去了硬约束的意义。</w:t>
       </w:r>
     </w:p>
     <w:p>
@@ -3815,7 +3841,7 @@
           <w:i w:val="0"/>
           <w:sz w:val="21"/>
         </w:rPr>
-        <w:t>：安全 BO / LLM 未参加 v3 五算法工况批跑，其工况曲线由冻结部署增益在同对象、同约束、同种子下补仿得到，不做任何训练/搜索。</w:t>
+        <w:t>：安全 BO / LLM 未参加 v3 五算法工况批跑，其工况曲线拿定好的参数重跑一遍得到（只画图、不训练不搜索），对象、约束、种子与 v3 相同。</w:t>
       </w:r>
     </w:p>
     <w:p>
@@ -5032,7 +5058,7 @@
                 <w:i w:val="0"/>
                 <w:sz w:val="18"/>
               </w:rPr>
-              <w:t>监督式 LLM 整定流程与安全门</w:t>
+              <w:t>监督式 LLM 整定流程与安全检查</w:t>
             </w:r>
           </w:p>
         </w:tc>
@@ -5737,7 +5763,7 @@
           <w:color w:val="595959"/>
           <w:sz w:val="19"/>
         </w:rPr>
-        <w:t xml:space="preserve"> 中注入密钥；未配置时脚本自动回退到启发式 provider，可用于验证流水线，但</w:t>
+        <w:t xml:space="preserve"> 中注入密钥；未配置时脚本自动切换为启发式 provider，可用于验证流水线，但</w:t>
       </w:r>
       <w:r>
         <w:rPr>

</xml_diff>